<commit_message>
Clasificacion de palabras (falta validar lo de digitos)
</commit_message>
<xml_diff>
--- a/exp_Reg.docx
+++ b/exp_Reg.docx
@@ -10,115 +10,36 @@
     <w:p/>
     <w:p>
       <w:r>
-        <w:t xml:space="preserve">Identificadores: </w:t>
+        <w:t>Identificadores: ( [a-z</w:t>
       </w:r>
-      <w:proofErr w:type="gramStart"/>
-      <w:r>
-        <w:t>( [</w:t>
-      </w:r>
-      <w:proofErr w:type="gramEnd"/>
-      <w:r>
-        <w:t>a-z</w:t>
-      </w:r>
-      <w:proofErr w:type="gramStart"/>
       <w:r>
         <w:t>]</w:t>
       </w:r>
       <w:r>
-        <w:t xml:space="preserve"> )</w:t>
-      </w:r>
-      <w:proofErr w:type="gramEnd"/>
-      <w:r>
-        <w:t xml:space="preserve"> . </w:t>
-      </w:r>
-      <w:proofErr w:type="gramStart"/>
-      <w:r>
-        <w:t>( [</w:t>
-      </w:r>
-      <w:proofErr w:type="gramEnd"/>
-      <w:r>
-        <w:t>a-z] | _ | [A-Z] | [0-9</w:t>
-      </w:r>
-      <w:proofErr w:type="gramStart"/>
-      <w:r>
-        <w:t>] )</w:t>
-      </w:r>
-      <w:proofErr w:type="gramEnd"/>
-      <w:r>
-        <w:t>*</w:t>
+        <w:t xml:space="preserve"> ) . ( [a-z] | [A-Z] | [0-9] )*</w:t>
       </w:r>
     </w:p>
     <w:p>
       <w:r>
-        <w:t xml:space="preserve">Dígitos: </w:t>
+        <w:t>Dígitos: ( [0-9]</w:t>
       </w:r>
-      <w:proofErr w:type="gramStart"/>
-      <w:r>
-        <w:t>( [</w:t>
-      </w:r>
-      <w:proofErr w:type="gramEnd"/>
-      <w:r>
-        <w:t>0-9]</w:t>
-      </w:r>
-      <w:proofErr w:type="gramStart"/>
       <w:r>
         <w:t xml:space="preserve">+ </w:t>
       </w:r>
       <w:r>
-        <w:t>)</w:t>
-      </w:r>
-      <w:proofErr w:type="gramEnd"/>
-      <w:r>
-        <w:t xml:space="preserve"> . (</w:t>
-      </w:r>
-      <w:proofErr w:type="gramStart"/>
-      <w:r>
-        <w:t>\.[</w:t>
-      </w:r>
-      <w:proofErr w:type="gramEnd"/>
-      <w:r>
-        <w:t>0-9]</w:t>
-      </w:r>
-      <w:proofErr w:type="gramStart"/>
-      <w:r>
-        <w:t>+ )</w:t>
-      </w:r>
-      <w:proofErr w:type="gramEnd"/>
-      <w:r>
-        <w:t>?</w:t>
+        <w:t>) . (\.[0-9]+ )?</w:t>
       </w:r>
     </w:p>
     <w:p>
       <w:r>
-        <w:t xml:space="preserve">Palabras Reservadas: </w:t>
-      </w:r>
-      <w:proofErr w:type="gramStart"/>
-      <w:r>
-        <w:t>(</w:t>
+        <w:t>Palabras Reservadas: (</w:t>
       </w:r>
       <w:r>
-        <w:t xml:space="preserve"> [</w:t>
-      </w:r>
-      <w:proofErr w:type="gramEnd"/>
-      <w:r>
-        <w:t>A-Z</w:t>
-      </w:r>
-      <w:proofErr w:type="gramStart"/>
-      <w:r>
-        <w:t>] .</w:t>
-      </w:r>
-      <w:proofErr w:type="gramEnd"/>
-      <w:r>
-        <w:t xml:space="preserve"> [a-z]</w:t>
-      </w:r>
-      <w:proofErr w:type="gramStart"/>
-      <w:r>
-        <w:t xml:space="preserve">+ </w:t>
+        <w:t xml:space="preserve"> [A-Z] . [a-z]+ </w:t>
       </w:r>
       <w:r>
         <w:t>)</w:t>
       </w:r>
-      <w:proofErr w:type="gramEnd"/>
     </w:p>
     <w:p/>
     <w:p/>

</xml_diff>